<commit_message>
Update howTo 08 Build IP For Zynq.docx
Modifications to 2024
</commit_message>
<xml_diff>
--- a/Advanced-Digital-Design/howTo/howTo 08 Build IP For Zynq.docx
+++ b/Advanced-Digital-Design/howTo/howTo 08 Build IP For Zynq.docx
@@ -628,6 +628,9 @@
       <w:r>
         <w:t xml:space="preserve">You have just created an empty shell of the new IP.  </w:t>
       </w:r>
+      <w:r>
+        <w:t>Open the IP Catalog by clicking on the associated link in the Flow Manager on the left side of the screen.</w:t>
+      </w:r>
     </w:p>
     <w:p/>
     <w:p>
@@ -729,18 +732,23 @@
     <w:p/>
     <w:p>
       <w:r>
-        <w:t>It’s time to fill that shell with your custom logic. To do go to the IP Catalog tab, expand the User Repository -&gt; AXI Peripheral and then right click on “enhancedPwm_ip_v1.0” and select “Edit in Packager”</w:t>
-      </w:r>
-    </w:p>
-    <w:p/>
+        <w:t xml:space="preserve">It’s time to fill that shell with your custom logic. To do go to the IP Catalog tab, expand the User Repository -&gt; AXI Peripheral and then right click on “enhancedPwm_ip_v1.0” and select “Edit in </w:t>
+      </w:r>
+      <w:r>
+        <w:t xml:space="preserve">IP </w:t>
+      </w:r>
+      <w:r>
+        <w:t>Packager”</w:t>
+      </w:r>
+    </w:p>
     <w:p>
       <w:r>
         <w:rPr>
           <w:noProof/>
         </w:rPr>
         <w:drawing>
-          <wp:inline distT="0" distB="0" distL="0" distR="0" wp14:anchorId="3D03AB4A" wp14:editId="3909D70A">
-            <wp:extent cx="5946140" cy="1891665"/>
+          <wp:inline distT="0" distB="0" distL="0" distR="0" wp14:anchorId="3D03AB4A" wp14:editId="07DFF582">
+            <wp:extent cx="4019550" cy="1278753"/>
             <wp:effectExtent l="0" t="0" r="0" b="0"/>
             <wp:docPr id="2004350409" name="Picture 1"/>
             <wp:cNvGraphicFramePr>
@@ -762,7 +770,7 @@
                   <pic:spPr>
                     <a:xfrm>
                       <a:off x="0" y="0"/>
-                      <a:ext cx="5946140" cy="1891665"/>
+                      <a:ext cx="4034971" cy="1283659"/>
                     </a:xfrm>
                     <a:prstGeom prst="rect">
                       <a:avLst/>
@@ -822,18 +830,28 @@
         <w:t xml:space="preserve"> component </w:t>
       </w:r>
       <w:r>
-        <w:t xml:space="preserve">into a form that will make it compatible to the AXI bus used by the Zynq processor.  Start by adding </w:t>
-      </w:r>
-      <w:proofErr w:type="spellStart"/>
-      <w:r>
-        <w:t>enhancedPwm</w:t>
-      </w:r>
-      <w:proofErr w:type="spellEnd"/>
-      <w:r>
-        <w:t xml:space="preserve"> </w:t>
-      </w:r>
-      <w:r>
-        <w:t xml:space="preserve">to the project.  Do this by right clicking on Design Sources and selecting Add Sources… </w:t>
+        <w:t xml:space="preserve">into a form that will make it compatible </w:t>
+      </w:r>
+      <w:proofErr w:type="gramStart"/>
+      <w:r>
+        <w:t>to</w:t>
+      </w:r>
+      <w:proofErr w:type="gramEnd"/>
+      <w:r>
+        <w:t xml:space="preserve"> the AXI bus used by the Zynq processor.  </w:t>
+      </w:r>
+    </w:p>
+    <w:p>
+      <w:r>
+        <w:t xml:space="preserve">Before you start make sure that you have a pair of files in the Design Sources that </w:t>
+      </w:r>
+      <w:proofErr w:type="gramStart"/>
+      <w:r>
+        <w:t>looks</w:t>
+      </w:r>
+      <w:proofErr w:type="gramEnd"/>
+      <w:r>
+        <w:t xml:space="preserve"> like the following.  If you don’t follow the instructions below before proceeding.</w:t>
       </w:r>
     </w:p>
     <w:p>
@@ -841,7 +859,138 @@
         <w:rPr>
           <w:noProof/>
         </w:rPr>
+        <w:drawing>
+          <wp:inline distT="0" distB="0" distL="0" distR="0" wp14:anchorId="100576BC" wp14:editId="253B9E5F">
+            <wp:extent cx="4076700" cy="1557472"/>
+            <wp:effectExtent l="0" t="0" r="0" b="5080"/>
+            <wp:docPr id="1759269283" name="Picture 1" descr="A screenshot of a computer&#10;&#10;AI-generated content may be incorrect."/>
+            <wp:cNvGraphicFramePr>
+              <a:graphicFrameLocks xmlns:a="http://schemas.openxmlformats.org/drawingml/2006/main" noChangeAspect="1"/>
+            </wp:cNvGraphicFramePr>
+            <a:graphic xmlns:a="http://schemas.openxmlformats.org/drawingml/2006/main">
+              <a:graphicData uri="http://schemas.openxmlformats.org/drawingml/2006/picture">
+                <pic:pic xmlns:pic="http://schemas.openxmlformats.org/drawingml/2006/picture">
+                  <pic:nvPicPr>
+                    <pic:cNvPr id="1759269283" name="Picture 1" descr="A screenshot of a computer&#10;&#10;AI-generated content may be incorrect."/>
+                    <pic:cNvPicPr/>
+                  </pic:nvPicPr>
+                  <pic:blipFill>
+                    <a:blip r:embed="rId17"/>
+                    <a:stretch>
+                      <a:fillRect/>
+                    </a:stretch>
+                  </pic:blipFill>
+                  <pic:spPr>
+                    <a:xfrm>
+                      <a:off x="0" y="0"/>
+                      <a:ext cx="4087637" cy="1561650"/>
+                    </a:xfrm>
+                    <a:prstGeom prst="rect">
+                      <a:avLst/>
+                    </a:prstGeom>
+                  </pic:spPr>
+                </pic:pic>
+              </a:graphicData>
+            </a:graphic>
+          </wp:inline>
+        </w:drawing>
+      </w:r>
+    </w:p>
+    <w:p>
+      <w:r>
         <w:lastRenderedPageBreak/>
+        <w:t xml:space="preserve">If you have just a single file (just </w:t>
+      </w:r>
+      <w:r>
+        <w:t>enhancePwm_2024_slave_lite_v1_0_S00_AXI</w:t>
+      </w:r>
+      <w:r>
+        <w:t xml:space="preserve">) then close this IP instance of </w:t>
+      </w:r>
+      <w:proofErr w:type="spellStart"/>
+      <w:r>
+        <w:t>Vivado</w:t>
+      </w:r>
+      <w:proofErr w:type="spellEnd"/>
+      <w:r>
+        <w:t xml:space="preserve"> (File -&gt; Exit), saving if prompted.  Then back in the original project, Reopen the </w:t>
+      </w:r>
+      <w:proofErr w:type="spellStart"/>
+      <w:r>
+        <w:t>enhancedPwm</w:t>
+      </w:r>
+      <w:proofErr w:type="spellEnd"/>
+      <w:r>
+        <w:t xml:space="preserve"> IP by right clicking on it and selecting Edit in IP Packer.  Ignore the warning about overwriting the project, you have no edits that will be overwritten.</w:t>
+      </w:r>
+    </w:p>
+    <w:p>
+      <w:r>
+        <w:rPr>
+          <w:noProof/>
+        </w:rPr>
+        <w:drawing>
+          <wp:inline distT="0" distB="0" distL="0" distR="0" wp14:anchorId="122B2D49" wp14:editId="09B027A8">
+            <wp:extent cx="3486150" cy="2170467"/>
+            <wp:effectExtent l="0" t="0" r="0" b="1270"/>
+            <wp:docPr id="1385542806" name="Picture 1" descr="A screenshot of a computer&#10;&#10;AI-generated content may be incorrect."/>
+            <wp:cNvGraphicFramePr>
+              <a:graphicFrameLocks xmlns:a="http://schemas.openxmlformats.org/drawingml/2006/main" noChangeAspect="1"/>
+            </wp:cNvGraphicFramePr>
+            <a:graphic xmlns:a="http://schemas.openxmlformats.org/drawingml/2006/main">
+              <a:graphicData uri="http://schemas.openxmlformats.org/drawingml/2006/picture">
+                <pic:pic xmlns:pic="http://schemas.openxmlformats.org/drawingml/2006/picture">
+                  <pic:nvPicPr>
+                    <pic:cNvPr id="1385542806" name="Picture 1" descr="A screenshot of a computer&#10;&#10;AI-generated content may be incorrect."/>
+                    <pic:cNvPicPr/>
+                  </pic:nvPicPr>
+                  <pic:blipFill>
+                    <a:blip r:embed="rId18"/>
+                    <a:stretch>
+                      <a:fillRect/>
+                    </a:stretch>
+                  </pic:blipFill>
+                  <pic:spPr>
+                    <a:xfrm>
+                      <a:off x="0" y="0"/>
+                      <a:ext cx="3488436" cy="2171890"/>
+                    </a:xfrm>
+                    <a:prstGeom prst="rect">
+                      <a:avLst/>
+                    </a:prstGeom>
+                  </pic:spPr>
+                </pic:pic>
+              </a:graphicData>
+            </a:graphic>
+          </wp:inline>
+        </w:drawing>
+      </w:r>
+    </w:p>
+    <w:p/>
+    <w:p>
+      <w:r>
+        <w:t xml:space="preserve">Start by adding </w:t>
+      </w:r>
+      <w:proofErr w:type="spellStart"/>
+      <w:r>
+        <w:t>enhancedPwm</w:t>
+      </w:r>
+      <w:r>
+        <w:t>.vhdl</w:t>
+      </w:r>
+      <w:proofErr w:type="spellEnd"/>
+      <w:r>
+        <w:t xml:space="preserve"> </w:t>
+      </w:r>
+      <w:r>
+        <w:t xml:space="preserve">to the project.  Do this by right clicking on Design Sources and selecting Add Sources… </w:t>
+      </w:r>
+    </w:p>
+    <w:p>
+      <w:r>
+        <w:rPr>
+          <w:noProof/>
+        </w:rPr>
         <w:drawing>
           <wp:inline distT="0" distB="0" distL="0" distR="0" wp14:anchorId="1C16F99F" wp14:editId="387316EA">
             <wp:extent cx="1800000" cy="1410098"/>
@@ -858,7 +1007,7 @@
                     <pic:cNvPicPr/>
                   </pic:nvPicPr>
                   <pic:blipFill>
-                    <a:blip r:embed="rId17"/>
+                    <a:blip r:embed="rId19"/>
                     <a:stretch>
                       <a:fillRect/>
                     </a:stretch>
@@ -905,7 +1054,7 @@
                     <pic:cNvPicPr/>
                   </pic:nvPicPr>
                   <pic:blipFill>
-                    <a:blip r:embed="rId18"/>
+                    <a:blip r:embed="rId20"/>
                     <a:stretch>
                       <a:fillRect/>
                     </a:stretch>
@@ -936,6 +1085,7 @@
         <w:rPr>
           <w:noProof/>
         </w:rPr>
+        <w:lastRenderedPageBreak/>
         <w:drawing>
           <wp:inline distT="0" distB="0" distL="0" distR="0" wp14:anchorId="7F4015D3" wp14:editId="32316447">
             <wp:extent cx="3683156" cy="2500132"/>
@@ -954,7 +1104,7 @@
                     </pic:cNvPicPr>
                   </pic:nvPicPr>
                   <pic:blipFill>
-                    <a:blip r:embed="rId19">
+                    <a:blip r:embed="rId21">
                       <a:extLst>
                         <a:ext uri="{28A0092B-C50C-407E-A947-70E740481C1C}">
                           <a14:useLocalDpi xmlns:a14="http://schemas.microsoft.com/office/drawing/2010/main" val="0"/>
@@ -1058,7 +1208,6 @@
           <w:sz w:val="36"/>
           <w:szCs w:val="36"/>
         </w:rPr>
-        <w:lastRenderedPageBreak/>
         <w:t>Edits to:</w:t>
       </w:r>
       <w:r>
@@ -1067,32 +1216,78 @@
           <w:szCs w:val="36"/>
         </w:rPr>
         <w:tab/>
-        <w:t>enhancedPwm</w:t>
       </w:r>
       <w:r>
         <w:rPr>
           <w:sz w:val="36"/>
           <w:szCs w:val="36"/>
         </w:rPr>
-        <w:t>_ip_v1_0_S00_AXI</w:t>
-      </w:r>
-      <w:r>
-        <w:rPr>
-          <w:sz w:val="36"/>
-          <w:szCs w:val="36"/>
-        </w:rPr>
+        <w:t>enhancePwm_2024_slave_lite_v1_0_S00_AXI</w:t>
+      </w:r>
+    </w:p>
+    <w:p>
+      <w:r>
+        <w:t xml:space="preserve">Start by </w:t>
+      </w:r>
+      <w:r>
+        <w:t xml:space="preserve">declaring the </w:t>
+      </w:r>
+      <w:proofErr w:type="spellStart"/>
+      <w:r>
+        <w:t>enhancedPwm</w:t>
+      </w:r>
+      <w:proofErr w:type="spellEnd"/>
+      <w:r>
         <w:t xml:space="preserve"> </w:t>
       </w:r>
-    </w:p>
-    <w:p>
-      <w:r>
-        <w:t xml:space="preserve">Start by </w:t>
-      </w:r>
-      <w:r>
-        <w:t xml:space="preserve">declaring the </w:t>
+      <w:r>
+        <w:t xml:space="preserve">as a component </w:t>
+      </w:r>
+      <w:r>
+        <w:t>inside</w:t>
+      </w:r>
+      <w:r>
+        <w:t xml:space="preserve"> </w:t>
+      </w:r>
+      <w:proofErr w:type="gramStart"/>
+      <w:r>
+        <w:t>enhancePwm_2024_slave_lite_v1_0_S00_AXI</w:t>
+      </w:r>
+      <w:r>
+        <w:t>.</w:t>
+      </w:r>
+      <w:r>
+        <w:t xml:space="preserve">vhd  </w:t>
+      </w:r>
+      <w:r>
+        <w:t>Open</w:t>
+      </w:r>
+      <w:proofErr w:type="gramEnd"/>
+      <w:r>
+        <w:t xml:space="preserve"> </w:t>
+      </w:r>
+      <w:r>
+        <w:t xml:space="preserve">the </w:t>
       </w:r>
       <w:proofErr w:type="spellStart"/>
       <w:r>
+        <w:t>enhancedPwm.vhd</w:t>
+      </w:r>
+      <w:proofErr w:type="spellEnd"/>
+      <w:r>
+        <w:t xml:space="preserve"> file, cop</w:t>
+      </w:r>
+      <w:r>
+        <w:t>y</w:t>
+      </w:r>
+      <w:r>
+        <w:t xml:space="preserve"> the entity description </w:t>
+      </w:r>
+      <w:r>
+        <w:t xml:space="preserve">for the </w:t>
+      </w:r>
+      <w:proofErr w:type="spellStart"/>
+      <w:r>
         <w:t>enhancedPwm</w:t>
       </w:r>
       <w:proofErr w:type="spellEnd"/>
@@ -1100,81 +1295,54 @@
         <w:t xml:space="preserve"> </w:t>
       </w:r>
       <w:r>
-        <w:t xml:space="preserve">as a component </w:t>
-      </w:r>
-      <w:r>
-        <w:t xml:space="preserve">inside </w:t>
+        <w:t xml:space="preserve">and then paste it into </w:t>
       </w:r>
       <w:proofErr w:type="gramStart"/>
       <w:r>
-        <w:t>enhancedPwm_v1_0_S00_AXI</w:t>
-      </w:r>
-      <w:r>
-        <w:t xml:space="preserve">.vhd  </w:t>
-      </w:r>
-      <w:r>
-        <w:t>Open</w:t>
+        <w:t xml:space="preserve">the  </w:t>
+      </w:r>
+      <w:r>
+        <w:t>enhancePwm_2024_slave_lite_v1_0_S00_AXI</w:t>
+      </w:r>
+      <w:r>
+        <w:t>.vhd</w:t>
       </w:r>
       <w:proofErr w:type="gramEnd"/>
       <w:r>
-        <w:t xml:space="preserve"> </w:t>
-      </w:r>
-      <w:r>
-        <w:t xml:space="preserve">the </w:t>
+        <w:t xml:space="preserve"> file </w:t>
+      </w:r>
+      <w:r>
+        <w:t xml:space="preserve">below the signal declarations and just before the begin statement </w:t>
+      </w:r>
+      <w:r>
+        <w:t>in the architecture</w:t>
+      </w:r>
+      <w:r>
+        <w:t>.  Then change the entity description into a component description as shown below.</w:t>
+      </w:r>
+      <w:r>
+        <w:t xml:space="preserve">  </w:t>
+      </w:r>
+    </w:p>
+    <w:p>
+      <w:r>
+        <w:t xml:space="preserve">While we are here, include the definition of the </w:t>
       </w:r>
       <w:proofErr w:type="spellStart"/>
       <w:r>
-        <w:t>enhancedPwm.vhd</w:t>
+        <w:t>pwmCount_int</w:t>
       </w:r>
       <w:proofErr w:type="spellEnd"/>
       <w:r>
-        <w:t xml:space="preserve"> file, cop</w:t>
-      </w:r>
-      <w:r>
-        <w:t>y</w:t>
-      </w:r>
-      <w:r>
-        <w:t xml:space="preserve"> the entity description </w:t>
-      </w:r>
-      <w:r>
-        <w:t xml:space="preserve">for the </w:t>
+        <w:t xml:space="preserve"> signal that we will use to communicate the </w:t>
       </w:r>
       <w:proofErr w:type="spellStart"/>
       <w:r>
-        <w:t>enhancedPwm</w:t>
+        <w:t>pwm</w:t>
       </w:r>
       <w:proofErr w:type="spellEnd"/>
       <w:r>
-        <w:t xml:space="preserve"> </w:t>
-      </w:r>
-      <w:r>
-        <w:t xml:space="preserve">and then paste it into </w:t>
-      </w:r>
-      <w:proofErr w:type="gramStart"/>
-      <w:r>
-        <w:t xml:space="preserve">the  </w:t>
-      </w:r>
-      <w:r>
-        <w:t>enhancedPwm_v1_0_S00_AXI</w:t>
-      </w:r>
-      <w:r>
-        <w:t>.vhd</w:t>
-      </w:r>
-      <w:proofErr w:type="gramEnd"/>
-      <w:r>
-        <w:t xml:space="preserve"> file </w:t>
-      </w:r>
-      <w:r>
-        <w:t xml:space="preserve">below the signal declarations and just before the begin statement </w:t>
-      </w:r>
-      <w:r>
-        <w:t>in the architecture</w:t>
-      </w:r>
-      <w:r>
-        <w:t>.  Then change the entity description into a component description as shown below.</w:t>
-      </w:r>
-      <w:r>
-        <w:t xml:space="preserve">  </w:t>
+        <w:t xml:space="preserve"> count value to the Arm through the AXI interface.</w:t>
       </w:r>
     </w:p>
     <w:p>
@@ -1183,10 +1351,10 @@
           <w:noProof/>
         </w:rPr>
         <w:drawing>
-          <wp:inline distT="0" distB="0" distL="0" distR="0" wp14:anchorId="77217ECE" wp14:editId="2138DEE0">
-            <wp:extent cx="3240000" cy="1120477"/>
-            <wp:effectExtent l="0" t="0" r="0" b="3810"/>
-            <wp:docPr id="200257499" name="Picture 1"/>
+          <wp:inline distT="0" distB="0" distL="0" distR="0" wp14:anchorId="20C9C787" wp14:editId="747942DA">
+            <wp:extent cx="5536658" cy="1828800"/>
+            <wp:effectExtent l="0" t="0" r="6985" b="0"/>
+            <wp:docPr id="1049287100" name="Picture 1" descr="A computer code with text&#10;&#10;AI-generated content may be incorrect."/>
             <wp:cNvGraphicFramePr>
               <a:graphicFrameLocks xmlns:a="http://schemas.openxmlformats.org/drawingml/2006/main" noChangeAspect="1"/>
             </wp:cNvGraphicFramePr>
@@ -1194,250 +1362,7 @@
               <a:graphicData uri="http://schemas.openxmlformats.org/drawingml/2006/picture">
                 <pic:pic xmlns:pic="http://schemas.openxmlformats.org/drawingml/2006/picture">
                   <pic:nvPicPr>
-                    <pic:cNvPr id="200257499" name=""/>
-                    <pic:cNvPicPr/>
-                  </pic:nvPicPr>
-                  <pic:blipFill>
-                    <a:blip r:embed="rId20"/>
-                    <a:stretch>
-                      <a:fillRect/>
-                    </a:stretch>
-                  </pic:blipFill>
-                  <pic:spPr>
-                    <a:xfrm>
-                      <a:off x="0" y="0"/>
-                      <a:ext cx="3240000" cy="1120477"/>
-                    </a:xfrm>
-                    <a:prstGeom prst="rect">
-                      <a:avLst/>
-                    </a:prstGeom>
-                  </pic:spPr>
-                </pic:pic>
-              </a:graphicData>
-            </a:graphic>
-          </wp:inline>
-        </w:drawing>
-      </w:r>
-    </w:p>
-    <w:p>
-      <w:r>
-        <w:t>*Please note, your line numbers will be different as this screen shot represent the file when it was completed.  You have only just started editing the file.</w:t>
-      </w:r>
-    </w:p>
-    <w:p>
-      <w:pPr>
-        <w:ind w:left="0" w:firstLine="0"/>
-      </w:pPr>
-    </w:p>
-    <w:p>
-      <w:r>
-        <w:t xml:space="preserve">You now need to instantiate the </w:t>
-      </w:r>
-      <w:proofErr w:type="spellStart"/>
-      <w:r>
-        <w:t>enhancedPwm</w:t>
-      </w:r>
-      <w:proofErr w:type="spellEnd"/>
-      <w:r>
-        <w:t xml:space="preserve"> component inside the AXI file.  Do this as follows.</w:t>
-      </w:r>
-    </w:p>
-    <w:p>
-      <w:r>
-        <w:t xml:space="preserve">In the “add user logic” section of the AXI file, instantiate the </w:t>
-      </w:r>
-      <w:proofErr w:type="spellStart"/>
-      <w:r>
-        <w:t>enhancedPwm</w:t>
-      </w:r>
-      <w:proofErr w:type="spellEnd"/>
-      <w:r>
-        <w:t xml:space="preserve"> component.  The instantiation will:</w:t>
-      </w:r>
-    </w:p>
-    <w:p>
-      <w:pPr>
-        <w:pStyle w:val="ListParagraph"/>
-        <w:numPr>
-          <w:ilvl w:val="0"/>
-          <w:numId w:val="25"/>
-        </w:numPr>
-        <w:spacing w:after="0" w:line="240" w:lineRule="auto"/>
-      </w:pPr>
-      <w:r>
-        <w:t xml:space="preserve">Have the ARM set the value of the </w:t>
-      </w:r>
-      <w:proofErr w:type="spellStart"/>
-      <w:r>
-        <w:t>dutyCycle</w:t>
-      </w:r>
-      <w:proofErr w:type="spellEnd"/>
-      <w:r>
-        <w:t xml:space="preserve"> input through the slv_reg0.</w:t>
-      </w:r>
-    </w:p>
-    <w:p>
-      <w:pPr>
-        <w:pStyle w:val="ListParagraph"/>
-        <w:numPr>
-          <w:ilvl w:val="0"/>
-          <w:numId w:val="25"/>
-        </w:numPr>
-        <w:spacing w:after="0" w:line="240" w:lineRule="auto"/>
-      </w:pPr>
-      <w:r>
-        <w:t xml:space="preserve">Send the </w:t>
-      </w:r>
-      <w:proofErr w:type="spellStart"/>
-      <w:r>
-        <w:t>pwmCount</w:t>
-      </w:r>
-      <w:proofErr w:type="spellEnd"/>
-      <w:r>
-        <w:t xml:space="preserve"> output to </w:t>
-      </w:r>
-      <w:r>
-        <w:t xml:space="preserve">a local signal called </w:t>
-      </w:r>
-      <w:proofErr w:type="spellStart"/>
-      <w:r>
-        <w:t>pwmCount_int</w:t>
-      </w:r>
-      <w:proofErr w:type="spellEnd"/>
-      <w:r>
-        <w:t xml:space="preserve"> and on </w:t>
-      </w:r>
-      <w:r>
-        <w:t>the ARM through slv_reg1.</w:t>
-      </w:r>
-    </w:p>
-    <w:p>
-      <w:pPr>
-        <w:pStyle w:val="ListParagraph"/>
-        <w:numPr>
-          <w:ilvl w:val="0"/>
-          <w:numId w:val="25"/>
-        </w:numPr>
-        <w:spacing w:after="0" w:line="240" w:lineRule="auto"/>
-      </w:pPr>
-      <w:r>
-        <w:t xml:space="preserve">The </w:t>
-      </w:r>
-      <w:proofErr w:type="spellStart"/>
-      <w:r>
-        <w:t>clk</w:t>
-      </w:r>
-      <w:proofErr w:type="spellEnd"/>
-      <w:r>
-        <w:t xml:space="preserve"> is provided by some external signal, S_AXI_CLK.  You will see later that this is the common bus shared by all peripherals.  This is important because it keeps your custom hardware synchronized with the ZYNQ processor.</w:t>
-      </w:r>
-    </w:p>
-    <w:p>
-      <w:r>
-        <w:rPr>
-          <w:noProof/>
-        </w:rPr>
-        <w:drawing>
-          <wp:inline distT="0" distB="0" distL="0" distR="0" wp14:anchorId="6294A2EA" wp14:editId="2EA51B6C">
-            <wp:extent cx="4749800" cy="1824037"/>
-            <wp:effectExtent l="0" t="0" r="0" b="5080"/>
-            <wp:docPr id="2000275511" name="Picture 1"/>
-            <wp:cNvGraphicFramePr>
-              <a:graphicFrameLocks xmlns:a="http://schemas.openxmlformats.org/drawingml/2006/main" noChangeAspect="1"/>
-            </wp:cNvGraphicFramePr>
-            <a:graphic xmlns:a="http://schemas.openxmlformats.org/drawingml/2006/main">
-              <a:graphicData uri="http://schemas.openxmlformats.org/drawingml/2006/picture">
-                <pic:pic xmlns:pic="http://schemas.openxmlformats.org/drawingml/2006/picture">
-                  <pic:nvPicPr>
-                    <pic:cNvPr id="2000275511" name=""/>
-                    <pic:cNvPicPr/>
-                  </pic:nvPicPr>
-                  <pic:blipFill>
-                    <a:blip r:embed="rId21"/>
-                    <a:stretch>
-                      <a:fillRect/>
-                    </a:stretch>
-                  </pic:blipFill>
-                  <pic:spPr>
-                    <a:xfrm>
-                      <a:off x="0" y="0"/>
-                      <a:ext cx="4790443" cy="1839645"/>
-                    </a:xfrm>
-                    <a:prstGeom prst="rect">
-                      <a:avLst/>
-                    </a:prstGeom>
-                  </pic:spPr>
-                </pic:pic>
-              </a:graphicData>
-            </a:graphic>
-          </wp:inline>
-        </w:drawing>
-      </w:r>
-    </w:p>
-    <w:p>
-      <w:r>
-        <w:t>*Please note, your line numbers will be different as this screen shot represent the file when it was completed.  You have only just started editing the file.</w:t>
-      </w:r>
-    </w:p>
-    <w:p>
-      <w:r>
-        <w:t xml:space="preserve">Line 370: Add the </w:t>
-      </w:r>
-      <w:proofErr w:type="spellStart"/>
-      <w:r>
-        <w:t>pwmCount_int</w:t>
-      </w:r>
-      <w:proofErr w:type="spellEnd"/>
-      <w:r>
-        <w:t xml:space="preserve"> signal as the value for </w:t>
-      </w:r>
-      <w:proofErr w:type="spellStart"/>
-      <w:r>
-        <w:t>reg_data_out</w:t>
-      </w:r>
-      <w:proofErr w:type="spellEnd"/>
-      <w:r>
-        <w:t xml:space="preserve"> in place of slv_reg1.  This will allow the </w:t>
-      </w:r>
-      <w:proofErr w:type="spellStart"/>
-      <w:r>
-        <w:t>pwm</w:t>
-      </w:r>
-      <w:proofErr w:type="spellEnd"/>
-      <w:r>
-        <w:t xml:space="preserve"> counter to be read by the Zynq processor when the Zynq processor tries to read slv_reg1.</w:t>
-      </w:r>
-      <w:r>
-        <w:t xml:space="preserve">  Also add </w:t>
-      </w:r>
-      <w:proofErr w:type="spellStart"/>
-      <w:r>
-        <w:t>pwmCount_int</w:t>
-      </w:r>
-      <w:proofErr w:type="spellEnd"/>
-      <w:r>
-        <w:t xml:space="preserve"> to the sensitivity list.</w:t>
-      </w:r>
-    </w:p>
-    <w:p>
-      <w:r>
-        <w:rPr>
-          <w:noProof/>
-        </w:rPr>
-        <w:lastRenderedPageBreak/>
-        <w:drawing>
-          <wp:inline distT="0" distB="0" distL="0" distR="0" wp14:anchorId="3CCE260E" wp14:editId="74F90D2F">
-            <wp:extent cx="3488247" cy="1511300"/>
-            <wp:effectExtent l="0" t="0" r="0" b="0"/>
-            <wp:docPr id="298956379" name="Picture 1"/>
-            <wp:cNvGraphicFramePr>
-              <a:graphicFrameLocks xmlns:a="http://schemas.openxmlformats.org/drawingml/2006/main" noChangeAspect="1"/>
-            </wp:cNvGraphicFramePr>
-            <a:graphic xmlns:a="http://schemas.openxmlformats.org/drawingml/2006/main">
-              <a:graphicData uri="http://schemas.openxmlformats.org/drawingml/2006/picture">
-                <pic:pic xmlns:pic="http://schemas.openxmlformats.org/drawingml/2006/picture">
-                  <pic:nvPicPr>
-                    <pic:cNvPr id="298956379" name=""/>
+                    <pic:cNvPr id="1049287100" name="Picture 1" descr="A computer code with text&#10;&#10;AI-generated content may be incorrect."/>
                     <pic:cNvPicPr/>
                   </pic:nvPicPr>
                   <pic:blipFill>
@@ -1449,7 +1374,7 @@
                   <pic:spPr>
                     <a:xfrm>
                       <a:off x="0" y="0"/>
-                      <a:ext cx="3493060" cy="1513385"/>
+                      <a:ext cx="5536658" cy="1828800"/>
                     </a:xfrm>
                     <a:prstGeom prst="rect">
                       <a:avLst/>
@@ -1462,10 +1387,27 @@
         </w:drawing>
       </w:r>
     </w:p>
-    <w:p/>
-    <w:p>
-      <w:r>
-        <w:t xml:space="preserve">Just below your </w:t>
+    <w:p>
+      <w:r>
+        <w:t xml:space="preserve">*Please note, your line numbers will be different as this screen shot </w:t>
+      </w:r>
+      <w:proofErr w:type="gramStart"/>
+      <w:r>
+        <w:t>represent</w:t>
+      </w:r>
+      <w:proofErr w:type="gramEnd"/>
+      <w:r>
+        <w:t xml:space="preserve"> the file when it was completed.  You have only just started editing the file.</w:t>
+      </w:r>
+    </w:p>
+    <w:p>
+      <w:pPr>
+        <w:ind w:left="0" w:firstLine="0"/>
+      </w:pPr>
+    </w:p>
+    <w:p>
+      <w:r>
+        <w:t xml:space="preserve">You now need to instantiate the </w:t>
       </w:r>
       <w:proofErr w:type="spellStart"/>
       <w:r>
@@ -1473,28 +1415,116 @@
       </w:r>
       <w:proofErr w:type="spellEnd"/>
       <w:r>
-        <w:t xml:space="preserve"> component declaration you added earlier, add the declaration of </w:t>
+        <w:t xml:space="preserve"> component inside the AXI file.  Do this </w:t>
+      </w:r>
+      <w:r>
+        <w:t xml:space="preserve">at the bottom of the file </w:t>
+      </w:r>
+      <w:r>
+        <w:t>as follows.</w:t>
+      </w:r>
+      <w:r>
+        <w:t xml:space="preserve"> </w:t>
+      </w:r>
+      <w:r>
+        <w:t xml:space="preserve">In the “add user logic” section of the AXI file, instantiate the </w:t>
       </w:r>
       <w:proofErr w:type="spellStart"/>
       <w:r>
+        <w:t>enhancedPwm</w:t>
+      </w:r>
+      <w:proofErr w:type="spellEnd"/>
+      <w:r>
+        <w:t xml:space="preserve"> component.  The instantiation will:</w:t>
+      </w:r>
+    </w:p>
+    <w:p>
+      <w:pPr>
+        <w:pStyle w:val="ListParagraph"/>
+        <w:numPr>
+          <w:ilvl w:val="0"/>
+          <w:numId w:val="25"/>
+        </w:numPr>
+        <w:spacing w:after="0" w:line="240" w:lineRule="auto"/>
+      </w:pPr>
+      <w:r>
+        <w:t xml:space="preserve">Have the ARM set the value of the </w:t>
+      </w:r>
+      <w:proofErr w:type="spellStart"/>
+      <w:r>
+        <w:t>dutyCycle</w:t>
+      </w:r>
+      <w:proofErr w:type="spellEnd"/>
+      <w:r>
+        <w:t xml:space="preserve"> input through the slv_reg0.</w:t>
+      </w:r>
+    </w:p>
+    <w:p>
+      <w:pPr>
+        <w:pStyle w:val="ListParagraph"/>
+        <w:numPr>
+          <w:ilvl w:val="0"/>
+          <w:numId w:val="25"/>
+        </w:numPr>
+        <w:spacing w:after="0" w:line="240" w:lineRule="auto"/>
+      </w:pPr>
+      <w:r>
+        <w:t xml:space="preserve">Send the </w:t>
+      </w:r>
+      <w:proofErr w:type="spellStart"/>
+      <w:r>
+        <w:t>pwmCount</w:t>
+      </w:r>
+      <w:proofErr w:type="spellEnd"/>
+      <w:r>
+        <w:t xml:space="preserve"> output to </w:t>
+      </w:r>
+      <w:r>
+        <w:t xml:space="preserve">a local signal called </w:t>
+      </w:r>
+      <w:proofErr w:type="spellStart"/>
+      <w:r>
         <w:t>pwmCount_int</w:t>
       </w:r>
       <w:proofErr w:type="spellEnd"/>
       <w:r>
-        <w:t xml:space="preserve"> signal. </w:t>
-      </w:r>
-    </w:p>
-    <w:p/>
+        <w:t xml:space="preserve"> and on </w:t>
+      </w:r>
+      <w:r>
+        <w:t>the ARM through slv_reg1.</w:t>
+      </w:r>
+    </w:p>
+    <w:p>
+      <w:pPr>
+        <w:pStyle w:val="ListParagraph"/>
+        <w:numPr>
+          <w:ilvl w:val="0"/>
+          <w:numId w:val="25"/>
+        </w:numPr>
+        <w:spacing w:after="0" w:line="240" w:lineRule="auto"/>
+      </w:pPr>
+      <w:r>
+        <w:t xml:space="preserve">The </w:t>
+      </w:r>
+      <w:proofErr w:type="spellStart"/>
+      <w:r>
+        <w:t>clk</w:t>
+      </w:r>
+      <w:proofErr w:type="spellEnd"/>
+      <w:r>
+        <w:t xml:space="preserve"> is provided by some external signal, S_AXI_CLK.  You will see later that this is the common bus shared by all peripherals.  This is important because it keeps your custom hardware synchronized with the ZYNQ processor.</w:t>
+      </w:r>
+    </w:p>
     <w:p>
       <w:r>
         <w:rPr>
           <w:noProof/>
         </w:rPr>
         <w:drawing>
-          <wp:inline distT="0" distB="0" distL="0" distR="0" wp14:anchorId="7E025CE0" wp14:editId="3A44746A">
-            <wp:extent cx="2519680" cy="570416"/>
-            <wp:effectExtent l="0" t="0" r="0" b="1270"/>
-            <wp:docPr id="2122796477" name="Picture 1"/>
+          <wp:inline distT="0" distB="0" distL="0" distR="0" wp14:anchorId="75B7ED4C" wp14:editId="1164DF06">
+            <wp:extent cx="3617424" cy="1828800"/>
+            <wp:effectExtent l="0" t="0" r="2540" b="0"/>
+            <wp:docPr id="2103211555" name="Picture 1" descr="A screenshot of a computer code&#10;&#10;AI-generated content may be incorrect."/>
             <wp:cNvGraphicFramePr>
               <a:graphicFrameLocks xmlns:a="http://schemas.openxmlformats.org/drawingml/2006/main" noChangeAspect="1"/>
             </wp:cNvGraphicFramePr>
@@ -1502,7 +1532,7 @@
               <a:graphicData uri="http://schemas.openxmlformats.org/drawingml/2006/picture">
                 <pic:pic xmlns:pic="http://schemas.openxmlformats.org/drawingml/2006/picture">
                   <pic:nvPicPr>
-                    <pic:cNvPr id="2122796477" name=""/>
+                    <pic:cNvPr id="2103211555" name="Picture 1" descr="A screenshot of a computer code&#10;&#10;AI-generated content may be incorrect."/>
                     <pic:cNvPicPr/>
                   </pic:nvPicPr>
                   <pic:blipFill>
@@ -1514,7 +1544,7 @@
                   <pic:spPr>
                     <a:xfrm>
                       <a:off x="0" y="0"/>
-                      <a:ext cx="2543718" cy="575858"/>
+                      <a:ext cx="3617424" cy="1828800"/>
                     </a:xfrm>
                     <a:prstGeom prst="rect">
                       <a:avLst/>
@@ -1528,16 +1558,101 @@
       </w:r>
     </w:p>
     <w:p>
+      <w:r>
+        <w:t xml:space="preserve">*Please note, your line numbers will be different as this screen shot </w:t>
+      </w:r>
+      <w:proofErr w:type="gramStart"/>
+      <w:r>
+        <w:t>represent</w:t>
+      </w:r>
+      <w:proofErr w:type="gramEnd"/>
+      <w:r>
+        <w:t xml:space="preserve"> the file when it was completed.  You have only just started editing the file.</w:t>
+      </w:r>
+    </w:p>
+    <w:p>
+      <w:r>
+        <w:t xml:space="preserve">Line </w:t>
+      </w:r>
+      <w:r>
+        <w:t>317</w:t>
+      </w:r>
+      <w:r>
+        <w:t xml:space="preserve">: Add the </w:t>
+      </w:r>
+      <w:proofErr w:type="spellStart"/>
+      <w:r>
+        <w:t>pwmCount_int</w:t>
+      </w:r>
+      <w:proofErr w:type="spellEnd"/>
+      <w:r>
+        <w:t xml:space="preserve"> signal as the value for slv_reg1.  This will allow the </w:t>
+      </w:r>
+      <w:proofErr w:type="spellStart"/>
+      <w:r>
+        <w:t>pwm</w:t>
+      </w:r>
+      <w:proofErr w:type="spellEnd"/>
+      <w:r>
+        <w:t xml:space="preserve"> counter to be read by the Zynq processor when the Zynq processor tries to read slv_reg1.</w:t>
+      </w:r>
+      <w:r>
+        <w:t xml:space="preserve">  </w:t>
+      </w:r>
+    </w:p>
+    <w:p>
+      <w:r>
+        <w:rPr>
+          <w:noProof/>
+        </w:rPr>
+        <w:drawing>
+          <wp:inline distT="0" distB="0" distL="0" distR="0" wp14:anchorId="15FD6A59" wp14:editId="0726C845">
+            <wp:extent cx="5946140" cy="922020"/>
+            <wp:effectExtent l="0" t="0" r="0" b="0"/>
+            <wp:docPr id="91985194" name="Picture 1" descr="A close up of text&#10;&#10;AI-generated content may be incorrect."/>
+            <wp:cNvGraphicFramePr>
+              <a:graphicFrameLocks xmlns:a="http://schemas.openxmlformats.org/drawingml/2006/main" noChangeAspect="1"/>
+            </wp:cNvGraphicFramePr>
+            <a:graphic xmlns:a="http://schemas.openxmlformats.org/drawingml/2006/main">
+              <a:graphicData uri="http://schemas.openxmlformats.org/drawingml/2006/picture">
+                <pic:pic xmlns:pic="http://schemas.openxmlformats.org/drawingml/2006/picture">
+                  <pic:nvPicPr>
+                    <pic:cNvPr id="91985194" name="Picture 1" descr="A close up of text&#10;&#10;AI-generated content may be incorrect."/>
+                    <pic:cNvPicPr/>
+                  </pic:nvPicPr>
+                  <pic:blipFill>
+                    <a:blip r:embed="rId24"/>
+                    <a:stretch>
+                      <a:fillRect/>
+                    </a:stretch>
+                  </pic:blipFill>
+                  <pic:spPr>
+                    <a:xfrm>
+                      <a:off x="0" y="0"/>
+                      <a:ext cx="5946140" cy="922020"/>
+                    </a:xfrm>
+                    <a:prstGeom prst="rect">
+                      <a:avLst/>
+                    </a:prstGeom>
+                  </pic:spPr>
+                </pic:pic>
+              </a:graphicData>
+            </a:graphic>
+          </wp:inline>
+        </w:drawing>
+      </w:r>
+    </w:p>
+    <w:p>
       <w:pPr>
         <w:ind w:left="0" w:firstLine="0"/>
       </w:pPr>
     </w:p>
     <w:p>
       <w:r>
-        <w:t>Line 19: Add signals to the port description of enhancedPwm</w:t>
-      </w:r>
-      <w:r>
-        <w:t>_ip_v1_0_S00_AXI</w:t>
+        <w:t xml:space="preserve">Line 19: Add signals to the port description of </w:t>
+      </w:r>
+      <w:r>
+        <w:t>enhancePwm_2024_slave_lite_v1_0_S00_AXI</w:t>
       </w:r>
       <w:r>
         <w:t xml:space="preserve">.  You will need to route these signals outside the Zynq chip.  The 1-bits </w:t>
@@ -1591,7 +1706,7 @@
                     <pic:cNvPicPr/>
                   </pic:nvPicPr>
                   <pic:blipFill>
-                    <a:blip r:embed="rId24"/>
+                    <a:blip r:embed="rId25"/>
                     <a:stretch>
                       <a:fillRect/>
                     </a:stretch>
@@ -1615,19 +1730,24 @@
     <w:p/>
     <w:p>
       <w:r>
-        <w:t>You are done editing enhancedPwm</w:t>
-      </w:r>
-      <w:r>
-        <w:t>_ip_v1_0_S00_AXI</w:t>
-      </w:r>
-      <w:r>
-        <w:t>.  It’s now time to edit this file’s wrapper enhancedPwm</w:t>
-      </w:r>
-      <w:r>
-        <w:t>_ip_v1_0</w:t>
-      </w:r>
-    </w:p>
-    <w:p/>
+        <w:lastRenderedPageBreak/>
+        <w:t xml:space="preserve">You are done editing </w:t>
+      </w:r>
+      <w:r>
+        <w:t>enhancePwm_2024_slave_lite_v1_0_S00_AXI</w:t>
+      </w:r>
+      <w:r>
+        <w:t xml:space="preserve">.  It’s now time to edit this file’s wrapper </w:t>
+      </w:r>
+      <w:r>
+        <w:t>enhancePwm_2024</w:t>
+      </w:r>
+    </w:p>
+    <w:p>
+      <w:pPr>
+        <w:ind w:left="0" w:firstLine="0"/>
+      </w:pPr>
+    </w:p>
     <w:p>
       <w:pPr>
         <w:rPr>
@@ -1640,14 +1760,14 @@
           <w:sz w:val="36"/>
           <w:szCs w:val="36"/>
         </w:rPr>
-        <w:t>Edits to: enhancedPwm</w:t>
+        <w:t xml:space="preserve">Edits to: </w:t>
       </w:r>
       <w:r>
         <w:rPr>
           <w:sz w:val="36"/>
           <w:szCs w:val="36"/>
         </w:rPr>
-        <w:t>_ip_v1_0</w:t>
+        <w:t>enhancePwm_2024</w:t>
       </w:r>
     </w:p>
     <w:p>
@@ -1660,10 +1780,7 @@
       </w:r>
       <w:proofErr w:type="spellEnd"/>
       <w:r>
-        <w:t>,</w:t>
-      </w:r>
-      <w:r>
-        <w:t xml:space="preserve"> </w:t>
+        <w:t xml:space="preserve">, </w:t>
       </w:r>
       <w:proofErr w:type="spellStart"/>
       <w:r>
@@ -1679,33 +1796,35 @@
       </w:r>
       <w:proofErr w:type="spellEnd"/>
       <w:r>
-        <w:t xml:space="preserve"> signals outside this module.  It’s fairly straightforward.</w:t>
-      </w:r>
-    </w:p>
-    <w:p/>
-    <w:p>
-      <w:r>
-        <w:t>Line 94: Add signals to instantiation of enhancedPwm</w:t>
-      </w:r>
-      <w:r>
-        <w:t>_ip_v1_0_S00_AXI</w:t>
-      </w:r>
-      <w:r>
-        <w:t xml:space="preserve">. </w:t>
-      </w:r>
-    </w:p>
-    <w:p/>
+        <w:t xml:space="preserve"> signals outside this module.  It’s </w:t>
+      </w:r>
+      <w:proofErr w:type="gramStart"/>
+      <w:r>
+        <w:t>fairly straightforward</w:t>
+      </w:r>
+      <w:proofErr w:type="gramEnd"/>
+      <w:r>
+        <w:t>.</w:t>
+      </w:r>
+    </w:p>
+    <w:p>
+      <w:r>
+        <w:t xml:space="preserve">Line 19: Add signals to port description of </w:t>
+      </w:r>
+      <w:r>
+        <w:t>enhancePwm_2024</w:t>
+      </w:r>
+    </w:p>
     <w:p>
       <w:r>
         <w:rPr>
           <w:noProof/>
         </w:rPr>
-        <w:lastRenderedPageBreak/>
         <w:drawing>
-          <wp:inline distT="0" distB="0" distL="0" distR="0" wp14:anchorId="00158A16" wp14:editId="57E40FFD">
-            <wp:extent cx="3105150" cy="1480175"/>
-            <wp:effectExtent l="0" t="0" r="0" b="6350"/>
-            <wp:docPr id="1769259630" name="Picture 1"/>
+          <wp:inline distT="0" distB="0" distL="0" distR="0" wp14:anchorId="69005BF5" wp14:editId="4DD4AC81">
+            <wp:extent cx="2774462" cy="1143000"/>
+            <wp:effectExtent l="0" t="0" r="6985" b="0"/>
+            <wp:docPr id="1040816448" name="Picture 1" descr="A text with red circle&#10;&#10;AI-generated content may be incorrect."/>
             <wp:cNvGraphicFramePr>
               <a:graphicFrameLocks xmlns:a="http://schemas.openxmlformats.org/drawingml/2006/main" noChangeAspect="1"/>
             </wp:cNvGraphicFramePr>
@@ -1713,113 +1832,11 @@
               <a:graphicData uri="http://schemas.openxmlformats.org/drawingml/2006/picture">
                 <pic:pic xmlns:pic="http://schemas.openxmlformats.org/drawingml/2006/picture">
                   <pic:nvPicPr>
-                    <pic:cNvPr id="1769259630" name=""/>
-                    <pic:cNvPicPr/>
-                  </pic:nvPicPr>
-                  <pic:blipFill>
-                    <a:blip r:embed="rId25"/>
-                    <a:stretch>
-                      <a:fillRect/>
-                    </a:stretch>
-                  </pic:blipFill>
-                  <pic:spPr>
-                    <a:xfrm>
-                      <a:off x="0" y="0"/>
-                      <a:ext cx="3110250" cy="1482606"/>
-                    </a:xfrm>
-                    <a:prstGeom prst="rect">
-                      <a:avLst/>
-                    </a:prstGeom>
-                  </pic:spPr>
-                </pic:pic>
-              </a:graphicData>
-            </a:graphic>
-          </wp:inline>
-        </w:drawing>
-      </w:r>
-    </w:p>
-    <w:p/>
-    <w:p>
-      <w:r>
-        <w:t xml:space="preserve">Line 59: Add signals to component declaration of </w:t>
-      </w:r>
-      <w:r>
-        <w:t>my_counter_ip_v1_0_S00_AXI</w:t>
-      </w:r>
-    </w:p>
-    <w:p>
-      <w:r>
-        <w:rPr>
-          <w:noProof/>
-        </w:rPr>
-        <w:drawing>
-          <wp:inline distT="0" distB="0" distL="0" distR="0" wp14:anchorId="46D95C2F" wp14:editId="33639F9E">
-            <wp:extent cx="2844800" cy="1240589"/>
-            <wp:effectExtent l="0" t="0" r="0" b="0"/>
-            <wp:docPr id="687080397" name="Picture 1"/>
-            <wp:cNvGraphicFramePr>
-              <a:graphicFrameLocks xmlns:a="http://schemas.openxmlformats.org/drawingml/2006/main" noChangeAspect="1"/>
-            </wp:cNvGraphicFramePr>
-            <a:graphic xmlns:a="http://schemas.openxmlformats.org/drawingml/2006/main">
-              <a:graphicData uri="http://schemas.openxmlformats.org/drawingml/2006/picture">
-                <pic:pic xmlns:pic="http://schemas.openxmlformats.org/drawingml/2006/picture">
-                  <pic:nvPicPr>
-                    <pic:cNvPr id="687080397" name=""/>
+                    <pic:cNvPr id="1040816448" name="Picture 1" descr="A text with red circle&#10;&#10;AI-generated content may be incorrect."/>
                     <pic:cNvPicPr/>
                   </pic:nvPicPr>
                   <pic:blipFill>
                     <a:blip r:embed="rId26"/>
-                    <a:stretch>
-                      <a:fillRect/>
-                    </a:stretch>
-                  </pic:blipFill>
-                  <pic:spPr>
-                    <a:xfrm>
-                      <a:off x="0" y="0"/>
-                      <a:ext cx="2849225" cy="1242519"/>
-                    </a:xfrm>
-                    <a:prstGeom prst="rect">
-                      <a:avLst/>
-                    </a:prstGeom>
-                  </pic:spPr>
-                </pic:pic>
-              </a:graphicData>
-            </a:graphic>
-          </wp:inline>
-        </w:drawing>
-      </w:r>
-    </w:p>
-    <w:p/>
-    <w:p>
-      <w:r>
-        <w:t xml:space="preserve">Line 19: Add signals to port description of </w:t>
-      </w:r>
-      <w:r>
-        <w:t>my_counter_ip_v1_0</w:t>
-      </w:r>
-    </w:p>
-    <w:p>
-      <w:r>
-        <w:rPr>
-          <w:noProof/>
-        </w:rPr>
-        <w:drawing>
-          <wp:inline distT="0" distB="0" distL="0" distR="0" wp14:anchorId="1CA89059" wp14:editId="75D29E2B">
-            <wp:extent cx="2774462" cy="1143000"/>
-            <wp:effectExtent l="0" t="0" r="6985" b="0"/>
-            <wp:docPr id="298960482" name="Picture 1"/>
-            <wp:cNvGraphicFramePr>
-              <a:graphicFrameLocks xmlns:a="http://schemas.openxmlformats.org/drawingml/2006/main" noChangeAspect="1"/>
-            </wp:cNvGraphicFramePr>
-            <a:graphic xmlns:a="http://schemas.openxmlformats.org/drawingml/2006/main">
-              <a:graphicData uri="http://schemas.openxmlformats.org/drawingml/2006/picture">
-                <pic:pic xmlns:pic="http://schemas.openxmlformats.org/drawingml/2006/picture">
-                  <pic:nvPicPr>
-                    <pic:cNvPr id="298960482" name=""/>
-                    <pic:cNvPicPr/>
-                  </pic:nvPicPr>
-                  <pic:blipFill>
-                    <a:blip r:embed="rId27"/>
                     <a:stretch>
                       <a:fillRect/>
                     </a:stretch>
@@ -1843,15 +1860,25 @@
     <w:p/>
     <w:p>
       <w:r>
-        <w:t xml:space="preserve">Save all the files and check the sources area of the project manager tab once it is done updating.  The </w:t>
-      </w:r>
-      <w:proofErr w:type="spellStart"/>
-      <w:r>
-        <w:t>enhancedPwm</w:t>
-      </w:r>
-      <w:proofErr w:type="spellEnd"/>
-      <w:r>
-        <w:t xml:space="preserve"> component should be part of the hierarchy and there should be no syntax errors.</w:t>
+        <w:t xml:space="preserve">Line </w:t>
+      </w:r>
+      <w:r>
+        <w:t>58</w:t>
+      </w:r>
+      <w:r>
+        <w:t>: Add signals to</w:t>
+      </w:r>
+      <w:r>
+        <w:t xml:space="preserve"> the</w:t>
+      </w:r>
+      <w:r>
+        <w:t xml:space="preserve"> instantiation of </w:t>
+      </w:r>
+      <w:r>
+        <w:t>enhancePwm_2024_slave_lite_v1_0_S00_AXI</w:t>
+      </w:r>
+      <w:r>
+        <w:t xml:space="preserve">. </w:t>
       </w:r>
     </w:p>
     <w:p>
@@ -1860,10 +1887,10 @@
           <w:noProof/>
         </w:rPr>
         <w:drawing>
-          <wp:inline distT="0" distB="0" distL="0" distR="0" wp14:anchorId="0E607C18" wp14:editId="26856E3A">
-            <wp:extent cx="2160000" cy="1255615"/>
-            <wp:effectExtent l="0" t="0" r="0" b="1905"/>
-            <wp:docPr id="1002561740" name="Picture 1"/>
+          <wp:inline distT="0" distB="0" distL="0" distR="0" wp14:anchorId="6744F643" wp14:editId="50563BCC">
+            <wp:extent cx="3311352" cy="1371600"/>
+            <wp:effectExtent l="0" t="0" r="3810" b="0"/>
+            <wp:docPr id="1065468007" name="Picture 1" descr="A screenshot of a computer code&#10;&#10;AI-generated content may be incorrect."/>
             <wp:cNvGraphicFramePr>
               <a:graphicFrameLocks xmlns:a="http://schemas.openxmlformats.org/drawingml/2006/main" noChangeAspect="1"/>
             </wp:cNvGraphicFramePr>
@@ -1871,7 +1898,65 @@
               <a:graphicData uri="http://schemas.openxmlformats.org/drawingml/2006/picture">
                 <pic:pic xmlns:pic="http://schemas.openxmlformats.org/drawingml/2006/picture">
                   <pic:nvPicPr>
-                    <pic:cNvPr id="1002561740" name=""/>
+                    <pic:cNvPr id="1065468007" name="Picture 1" descr="A screenshot of a computer code&#10;&#10;AI-generated content may be incorrect."/>
+                    <pic:cNvPicPr/>
+                  </pic:nvPicPr>
+                  <pic:blipFill>
+                    <a:blip r:embed="rId27"/>
+                    <a:stretch>
+                      <a:fillRect/>
+                    </a:stretch>
+                  </pic:blipFill>
+                  <pic:spPr>
+                    <a:xfrm>
+                      <a:off x="0" y="0"/>
+                      <a:ext cx="3311352" cy="1371600"/>
+                    </a:xfrm>
+                    <a:prstGeom prst="rect">
+                      <a:avLst/>
+                    </a:prstGeom>
+                  </pic:spPr>
+                </pic:pic>
+              </a:graphicData>
+            </a:graphic>
+          </wp:inline>
+        </w:drawing>
+      </w:r>
+    </w:p>
+    <w:p>
+      <w:pPr>
+        <w:ind w:left="0" w:firstLine="0"/>
+      </w:pPr>
+    </w:p>
+    <w:p>
+      <w:r>
+        <w:t xml:space="preserve">Line 96: Pass through the signal into </w:t>
+      </w:r>
+      <w:r>
+        <w:t>enhancePwm_2024_slave_lite_v1_0_S00_AXI</w:t>
+      </w:r>
+      <w:r>
+        <w:t>.</w:t>
+      </w:r>
+    </w:p>
+    <w:p>
+      <w:r>
+        <w:rPr>
+          <w:noProof/>
+        </w:rPr>
+        <w:drawing>
+          <wp:inline distT="0" distB="0" distL="0" distR="0" wp14:anchorId="6FEC8B89" wp14:editId="7AF3B181">
+            <wp:extent cx="5946140" cy="1837055"/>
+            <wp:effectExtent l="0" t="0" r="0" b="0"/>
+            <wp:docPr id="1313902843" name="Picture 1" descr="A screenshot of a computer code&#10;&#10;AI-generated content may be incorrect."/>
+            <wp:cNvGraphicFramePr>
+              <a:graphicFrameLocks xmlns:a="http://schemas.openxmlformats.org/drawingml/2006/main" noChangeAspect="1"/>
+            </wp:cNvGraphicFramePr>
+            <a:graphic xmlns:a="http://schemas.openxmlformats.org/drawingml/2006/main">
+              <a:graphicData uri="http://schemas.openxmlformats.org/drawingml/2006/picture">
+                <pic:pic xmlns:pic="http://schemas.openxmlformats.org/drawingml/2006/picture">
+                  <pic:nvPicPr>
+                    <pic:cNvPr id="1313902843" name="Picture 1" descr="A screenshot of a computer code&#10;&#10;AI-generated content may be incorrect."/>
                     <pic:cNvPicPr/>
                   </pic:nvPicPr>
                   <pic:blipFill>
@@ -1883,7 +1968,7 @@
                   <pic:spPr>
                     <a:xfrm>
                       <a:off x="0" y="0"/>
-                      <a:ext cx="2160000" cy="1255615"/>
+                      <a:ext cx="5946140" cy="1837055"/>
                     </a:xfrm>
                     <a:prstGeom prst="rect">
                       <a:avLst/>
@@ -1897,7 +1982,96 @@
       </w:r>
     </w:p>
     <w:p/>
-    <w:p>
+    <w:p/>
+    <w:p/>
+    <w:p>
+      <w:r>
+        <w:lastRenderedPageBreak/>
+        <w:t xml:space="preserve">Save </w:t>
+      </w:r>
+      <w:r>
+        <w:t xml:space="preserve">the file </w:t>
+      </w:r>
+      <w:r>
+        <w:t xml:space="preserve">and check the sources area of the project manager tab once it is done updating.  The </w:t>
+      </w:r>
+      <w:proofErr w:type="spellStart"/>
+      <w:r>
+        <w:t>enhancedPwm</w:t>
+      </w:r>
+      <w:proofErr w:type="spellEnd"/>
+      <w:r>
+        <w:t xml:space="preserve"> component should be part of the hierarchy and there should be no syntax errors.</w:t>
+      </w:r>
+    </w:p>
+    <w:p>
+      <w:r>
+        <w:rPr>
+          <w:noProof/>
+        </w:rPr>
+        <w:drawing>
+          <wp:inline distT="0" distB="0" distL="0" distR="0" wp14:anchorId="0DED2455" wp14:editId="06016496">
+            <wp:extent cx="3086100" cy="1252104"/>
+            <wp:effectExtent l="0" t="0" r="0" b="5715"/>
+            <wp:docPr id="985794809" name="Picture 1" descr="A screenshot of a computer&#10;&#10;AI-generated content may be incorrect."/>
+            <wp:cNvGraphicFramePr>
+              <a:graphicFrameLocks xmlns:a="http://schemas.openxmlformats.org/drawingml/2006/main" noChangeAspect="1"/>
+            </wp:cNvGraphicFramePr>
+            <a:graphic xmlns:a="http://schemas.openxmlformats.org/drawingml/2006/main">
+              <a:graphicData uri="http://schemas.openxmlformats.org/drawingml/2006/picture">
+                <pic:pic xmlns:pic="http://schemas.openxmlformats.org/drawingml/2006/picture">
+                  <pic:nvPicPr>
+                    <pic:cNvPr id="985794809" name="Picture 1" descr="A screenshot of a computer&#10;&#10;AI-generated content may be incorrect."/>
+                    <pic:cNvPicPr/>
+                  </pic:nvPicPr>
+                  <pic:blipFill>
+                    <a:blip r:embed="rId29"/>
+                    <a:stretch>
+                      <a:fillRect/>
+                    </a:stretch>
+                  </pic:blipFill>
+                  <pic:spPr>
+                    <a:xfrm>
+                      <a:off x="0" y="0"/>
+                      <a:ext cx="3106021" cy="1260186"/>
+                    </a:xfrm>
+                    <a:prstGeom prst="rect">
+                      <a:avLst/>
+                    </a:prstGeom>
+                  </pic:spPr>
+                </pic:pic>
+              </a:graphicData>
+            </a:graphic>
+          </wp:inline>
+        </w:drawing>
+      </w:r>
+    </w:p>
+    <w:p>
+      <w:pPr>
+        <w:ind w:left="0" w:firstLine="0"/>
+      </w:pPr>
+      <w:r>
+        <w:t>I’d suggest an extra layer of syntax checking by running a behavioral simulation.  You should only do this to check for warnings and errors in the Messages area at the bottom of the screen.  Only pay attention to syntax-related errors.  Ignore things like “Spawn Error”</w:t>
+      </w:r>
+      <w:r>
+        <w:t>.   You can also</w:t>
+      </w:r>
+      <w:r>
+        <w:t xml:space="preserve"> try to Generate Bitstream to weed out all elaboration errors from vector size </w:t>
+      </w:r>
+      <w:proofErr w:type="gramStart"/>
+      <w:r>
+        <w:t>mis-matches</w:t>
+      </w:r>
+      <w:proofErr w:type="gramEnd"/>
+      <w:r>
+        <w:t xml:space="preserve">.  </w:t>
+      </w:r>
+    </w:p>
+    <w:p>
+      <w:pPr>
+        <w:ind w:left="0" w:firstLine="0"/>
+      </w:pPr>
       <w:r>
         <w:t>Now it’s time to finish packaging your IP.  You will go through the packing steps in the Package IP tab.  Each of these is taken in turn below.</w:t>
       </w:r>
@@ -1994,7 +2168,7 @@
                     <pic:cNvPicPr/>
                   </pic:nvPicPr>
                   <pic:blipFill>
-                    <a:blip r:embed="rId29"/>
+                    <a:blip r:embed="rId30"/>
                     <a:stretch>
                       <a:fillRect/>
                     </a:stretch>
@@ -2056,7 +2230,7 @@
                     <pic:cNvPicPr/>
                   </pic:nvPicPr>
                   <pic:blipFill>
-                    <a:blip r:embed="rId30"/>
+                    <a:blip r:embed="rId31"/>
                     <a:stretch>
                       <a:fillRect/>
                     </a:stretch>
@@ -2089,10 +2263,17 @@
           <w:b/>
           <w:bCs/>
         </w:rPr>
+        <w:lastRenderedPageBreak/>
         <w:t>Ports and Interfaces</w:t>
       </w:r>
       <w:r>
-        <w:t xml:space="preserve"> – Notice that your </w:t>
+        <w:t xml:space="preserve"> – </w:t>
+      </w:r>
+      <w:r>
+        <w:t>Check</w:t>
+      </w:r>
+      <w:r>
+        <w:t xml:space="preserve"> that your </w:t>
       </w:r>
       <w:proofErr w:type="spellStart"/>
       <w:r>
@@ -2140,7 +2321,7 @@
                     <pic:cNvPicPr/>
                   </pic:nvPicPr>
                   <pic:blipFill>
-                    <a:blip r:embed="rId31"/>
+                    <a:blip r:embed="rId32"/>
                     <a:stretch>
                       <a:fillRect/>
                     </a:stretch>
@@ -2179,7 +2360,6 @@
         <w:rPr>
           <w:noProof/>
         </w:rPr>
-        <w:lastRenderedPageBreak/>
         <w:drawing>
           <wp:inline distT="0" distB="0" distL="0" distR="0" wp14:anchorId="7EB10F4D" wp14:editId="69A5032B">
             <wp:extent cx="2880000" cy="1386462"/>
@@ -2196,7 +2376,7 @@
                     <pic:cNvPicPr/>
                   </pic:nvPicPr>
                   <pic:blipFill>
-                    <a:blip r:embed="rId32"/>
+                    <a:blip r:embed="rId33"/>
                     <a:stretch>
                       <a:fillRect/>
                     </a:stretch>
@@ -2291,7 +2471,7 @@
                     <pic:cNvPicPr/>
                   </pic:nvPicPr>
                   <pic:blipFill>
-                    <a:blip r:embed="rId33"/>
+                    <a:blip r:embed="rId34"/>
                     <a:stretch>
                       <a:fillRect/>
                     </a:stretch>
@@ -2318,38 +2498,7 @@
         <w:ind w:left="0" w:firstLine="0"/>
       </w:pPr>
       <w:r>
-        <w:t>Before completing the final step of the IP process, it is much easier if you clear up any syntax errors that you may have created.  To do this, I like to run a simulation with the intention of weeding out errors, not to actually perform a simulation.  The error will most likely be contained in a file in the source project that you created to generate this IP.  In my case, this was:</w:t>
-      </w:r>
-    </w:p>
-    <w:p>
-      <w:pPr>
-        <w:ind w:left="0" w:firstLine="0"/>
-        <w:rPr>
-          <w:sz w:val="14"/>
-          <w:szCs w:val="14"/>
-        </w:rPr>
-      </w:pPr>
-      <w:r>
-        <w:rPr>
-          <w:sz w:val="14"/>
-          <w:szCs w:val="14"/>
-        </w:rPr>
-        <w:t>lab04_oscopeHardware\lab04_oscopeHardware.tmp\acquirewithhdmi_v1_0_project\acquireWithHDMI_v1_0_project.sim\sim_1\behav\xsim</w:t>
-      </w:r>
-    </w:p>
-    <w:p>
-      <w:pPr>
-        <w:ind w:left="0" w:firstLine="0"/>
-      </w:pPr>
-      <w:r>
-        <w:t xml:space="preserve">After weeding out the easy errors from the simulation.  You might as well try to Generate Bitstream to weed out all elaboration errors from vector size mis-matches.  </w:t>
-      </w:r>
-    </w:p>
-    <w:p>
-      <w:pPr>
-        <w:ind w:left="0" w:firstLine="0"/>
-      </w:pPr>
-      <w:r>
+        <w:lastRenderedPageBreak/>
         <w:t>When you get all the errors corrected, you should be safe to complete the process to generate your IP.</w:t>
       </w:r>
     </w:p>
@@ -2370,7 +2519,6 @@
         <w:rPr>
           <w:noProof/>
         </w:rPr>
-        <w:lastRenderedPageBreak/>
         <w:drawing>
           <wp:inline distT="0" distB="0" distL="0" distR="0" wp14:anchorId="0A67CFBF" wp14:editId="4B9978E6">
             <wp:extent cx="2880000" cy="1209846"/>
@@ -2387,7 +2535,7 @@
                     <pic:cNvPicPr/>
                   </pic:nvPicPr>
                   <pic:blipFill>
-                    <a:blip r:embed="rId34"/>
+                    <a:blip r:embed="rId35"/>
                     <a:stretch>
                       <a:fillRect/>
                     </a:stretch>
@@ -2415,12 +2563,12 @@
       </w:r>
     </w:p>
     <w:sectPr>
-      <w:headerReference w:type="even" r:id="rId35"/>
-      <w:headerReference w:type="default" r:id="rId36"/>
-      <w:footerReference w:type="even" r:id="rId37"/>
-      <w:footerReference w:type="default" r:id="rId38"/>
-      <w:headerReference w:type="first" r:id="rId39"/>
-      <w:footerReference w:type="first" r:id="rId40"/>
+      <w:headerReference w:type="even" r:id="rId36"/>
+      <w:headerReference w:type="default" r:id="rId37"/>
+      <w:footerReference w:type="even" r:id="rId38"/>
+      <w:footerReference w:type="default" r:id="rId39"/>
+      <w:headerReference w:type="first" r:id="rId40"/>
+      <w:footerReference w:type="first" r:id="rId41"/>
       <w:pgSz w:w="12240" w:h="15840"/>
       <w:pgMar w:top="1509" w:right="1436" w:bottom="1480" w:left="1440" w:header="720" w:footer="719" w:gutter="0"/>
       <w:cols w:space="720"/>

</xml_diff>

<commit_message>
update naming for 2024
The wrapper names have changes when migrating from 2022 to 2024.
</commit_message>
<xml_diff>
--- a/Advanced-Digital-Design/howTo/howTo 08 Build IP For Zynq.docx
+++ b/Advanced-Digital-Design/howTo/howTo 08 Build IP For Zynq.docx
@@ -3,6 +3,83 @@
 <w:document xmlns:wpc="http://schemas.microsoft.com/office/word/2010/wordprocessingCanvas" xmlns:cx="http://schemas.microsoft.com/office/drawing/2014/chartex" xmlns:cx1="http://schemas.microsoft.com/office/drawing/2015/9/8/chartex" xmlns:cx2="http://schemas.microsoft.com/office/drawing/2015/10/21/chartex" xmlns:cx3="http://schemas.microsoft.com/office/drawing/2016/5/9/chartex" xmlns:cx4="http://schemas.microsoft.com/office/drawing/2016/5/10/chartex" xmlns:cx5="http://schemas.microsoft.com/office/drawing/2016/5/11/chartex" xmlns:cx6="http://schemas.microsoft.com/office/drawing/2016/5/12/chartex" xmlns:cx7="http://schemas.microsoft.com/office/drawing/2016/5/13/chartex" xmlns:cx8="http://schemas.microsoft.com/office/drawing/2016/5/14/chartex" xmlns:mc="http://schemas.openxmlformats.org/markup-compatibility/2006" xmlns:aink="http://schemas.microsoft.com/office/drawing/2016/ink" xmlns:am3d="http://schemas.microsoft.com/office/drawing/2017/model3d" xmlns:o="urn:schemas-microsoft-com:office:office" xmlns:oel="http://schemas.microsoft.com/office/2019/extlst" xmlns:r="http://schemas.openxmlformats.org/officeDocument/2006/relationships" xmlns:m="http://schemas.openxmlformats.org/officeDocument/2006/math" xmlns:v="urn:schemas-microsoft-com:vml" xmlns:wp14="http://schemas.microsoft.com/office/word/2010/wordprocessingDrawing" xmlns:wp="http://schemas.openxmlformats.org/drawingml/2006/wordprocessingDrawing" xmlns:w10="urn:schemas-microsoft-com:office:word" xmlns:w="http://schemas.openxmlformats.org/wordprocessingml/2006/main" xmlns:w14="http://schemas.microsoft.com/office/word/2010/wordml" xmlns:w15="http://schemas.microsoft.com/office/word/2012/wordml" xmlns:w16cex="http://schemas.microsoft.com/office/word/2018/wordml/cex" xmlns:w16cid="http://schemas.microsoft.com/office/word/2016/wordml/cid" xmlns:w16="http://schemas.microsoft.com/office/word/2018/wordml" xmlns:w16du="http://schemas.microsoft.com/office/word/2023/wordml/word16du" xmlns:w16sdtdh="http://schemas.microsoft.com/office/word/2020/wordml/sdtdatahash" xmlns:w16sdtfl="http://schemas.microsoft.com/office/word/2024/wordml/sdtformatlock" xmlns:w16se="http://schemas.microsoft.com/office/word/2015/wordml/symex" xmlns:wpg="http://schemas.microsoft.com/office/word/2010/wordprocessingGroup" xmlns:wpi="http://schemas.microsoft.com/office/word/2010/wordprocessingInk" xmlns:wne="http://schemas.microsoft.com/office/word/2006/wordml" xmlns:wps="http://schemas.microsoft.com/office/word/2010/wordprocessingShape" mc:Ignorable="w14 w15 w16se w16cid w16 w16cex w16sdtdh w16sdtfl w16du wp14">
   <w:body>
     <w:p>
+      <w:proofErr w:type="spellStart"/>
+      <w:r>
+        <w:t>HowTo</w:t>
+      </w:r>
+      <w:proofErr w:type="spellEnd"/>
+      <w:r>
+        <w:t xml:space="preserve"> Build IP for the Zynq </w:t>
+      </w:r>
+    </w:p>
+    <w:p>
+      <w:pPr>
+        <w:rPr>
+          <w:u w:val="single"/>
+        </w:rPr>
+      </w:pPr>
+      <w:r>
+        <w:rPr>
+          <w:u w:val="single"/>
+        </w:rPr>
+        <w:t xml:space="preserve">These instructions are written for </w:t>
+      </w:r>
+      <w:proofErr w:type="spellStart"/>
+      <w:r>
+        <w:rPr>
+          <w:u w:val="single"/>
+        </w:rPr>
+        <w:t>Vivado</w:t>
+      </w:r>
+      <w:proofErr w:type="spellEnd"/>
+      <w:r>
+        <w:rPr>
+          <w:u w:val="single"/>
+        </w:rPr>
+        <w:t xml:space="preserve"> 2024.2 or later.  If you are running an earlier version of </w:t>
+      </w:r>
+      <w:proofErr w:type="spellStart"/>
+      <w:r>
+        <w:rPr>
+          <w:u w:val="single"/>
+        </w:rPr>
+        <w:t>Vivado</w:t>
+      </w:r>
+      <w:proofErr w:type="spellEnd"/>
+      <w:r>
+        <w:rPr>
+          <w:u w:val="single"/>
+        </w:rPr>
+        <w:t xml:space="preserve"> upgrade </w:t>
+      </w:r>
+      <w:r>
+        <w:rPr>
+          <w:u w:val="single"/>
+        </w:rPr>
+        <w:t xml:space="preserve">both </w:t>
+      </w:r>
+      <w:proofErr w:type="spellStart"/>
+      <w:r>
+        <w:rPr>
+          <w:u w:val="single"/>
+        </w:rPr>
+        <w:t>Vivado</w:t>
+      </w:r>
+      <w:proofErr w:type="spellEnd"/>
+      <w:r>
+        <w:rPr>
+          <w:u w:val="single"/>
+        </w:rPr>
+        <w:t xml:space="preserve"> and Vitis before proceeding</w:t>
+      </w:r>
+      <w:r>
+        <w:rPr>
+          <w:u w:val="single"/>
+        </w:rPr>
+        <w:t>.</w:t>
+      </w:r>
+    </w:p>
+    <w:p>
       <w:r>
         <w:t xml:space="preserve">You will need to start the process of creating custom IP from some existing </w:t>
       </w:r>
@@ -71,14 +148,11 @@
         <w:keepNext/>
       </w:pPr>
       <w:r>
-        <w:rPr>
-          <w:noProof/>
-        </w:rPr>
         <w:drawing>
-          <wp:inline distT="0" distB="0" distL="0" distR="0" wp14:anchorId="6F2A92F9" wp14:editId="5C793445">
-            <wp:extent cx="5946140" cy="2818765"/>
-            <wp:effectExtent l="0" t="0" r="0" b="635"/>
-            <wp:docPr id="31548873" name="Picture 1"/>
+          <wp:inline distT="0" distB="0" distL="0" distR="0" wp14:anchorId="0C64AD9A" wp14:editId="062EB3E4">
+            <wp:extent cx="5946140" cy="2843530"/>
+            <wp:effectExtent l="0" t="0" r="0" b="0"/>
+            <wp:docPr id="619097783" name="Picture 1" descr="A screenshot of a computer&#10;&#10;AI-generated content may be incorrect."/>
             <wp:cNvGraphicFramePr>
               <a:graphicFrameLocks xmlns:a="http://schemas.openxmlformats.org/drawingml/2006/main" noChangeAspect="1"/>
             </wp:cNvGraphicFramePr>
@@ -86,7 +160,7 @@
               <a:graphicData uri="http://schemas.openxmlformats.org/drawingml/2006/picture">
                 <pic:pic xmlns:pic="http://schemas.openxmlformats.org/drawingml/2006/picture">
                   <pic:nvPicPr>
-                    <pic:cNvPr id="31548873" name=""/>
+                    <pic:cNvPr id="619097783" name="Picture 1" descr="A screenshot of a computer&#10;&#10;AI-generated content may be incorrect."/>
                     <pic:cNvPicPr/>
                   </pic:nvPicPr>
                   <pic:blipFill>
@@ -98,7 +172,7 @@
                   <pic:spPr>
                     <a:xfrm>
                       <a:off x="0" y="0"/>
-                      <a:ext cx="5946140" cy="2818765"/>
+                      <a:ext cx="5946140" cy="2843530"/>
                     </a:xfrm>
                     <a:prstGeom prst="rect">
                       <a:avLst/>
@@ -180,7 +254,15 @@
         <w:t xml:space="preserve"> reset</w:t>
       </w:r>
       <w:r>
-        <w:t xml:space="preserve"> will come from the S_AXI signals coming in through the enhancedPwm_ip_v1_0_S00_AXI interface.</w:t>
+        <w:t xml:space="preserve"> will come from the S_AXI signals coming in through the </w:t>
+      </w:r>
+      <w:proofErr w:type="spellStart"/>
+      <w:r>
+        <w:t>enhancedPwm_AXI</w:t>
+      </w:r>
+      <w:proofErr w:type="spellEnd"/>
+      <w:r>
+        <w:t xml:space="preserve"> interface.</w:t>
       </w:r>
     </w:p>
     <w:p>
@@ -288,7 +370,18 @@
         <w:fldChar w:fldCharType="end"/>
       </w:r>
       <w:r>
-        <w:t xml:space="preserve"> are part of the AXI interface and as such, not your concern – leave them alone.  When a signal from your custom IP needs to leave the Zynq chip, you must add that signal to the two “enhancedPwm_ip_v1_0” interfaces. </w:t>
+        <w:t xml:space="preserve"> are part of the AXI interface and as such, not your concern – leave them alone.  When a signal from your custom IP needs to leave the Zynq chip, you must add that signal to the two “</w:t>
+      </w:r>
+      <w:proofErr w:type="spellStart"/>
+      <w:r>
+        <w:t>enhancedPwm_</w:t>
+      </w:r>
+      <w:r>
+        <w:t>AXI</w:t>
+      </w:r>
+      <w:proofErr w:type="spellEnd"/>
+      <w:r>
+        <w:t xml:space="preserve">” interfaces. </w:t>
       </w:r>
     </w:p>
     <w:p>
@@ -331,17 +424,46 @@
           <w:sz w:val="36"/>
           <w:szCs w:val="36"/>
         </w:rPr>
+        <w:lastRenderedPageBreak/>
         <w:t>Create Custom IP:</w:t>
       </w:r>
     </w:p>
     <w:p>
       <w:r>
+        <w:t xml:space="preserve">Create a folder just off your root directory called </w:t>
+      </w:r>
+      <w:proofErr w:type="spellStart"/>
+      <w:r>
+        <w:t>myRepo</w:t>
+      </w:r>
+      <w:proofErr w:type="spellEnd"/>
+      <w:r>
+        <w:t xml:space="preserve">.  This is where all your IP will be stored.  </w:t>
+      </w:r>
+      <w:proofErr w:type="spellStart"/>
+      <w:r>
+        <w:t>Vivado</w:t>
+      </w:r>
+      <w:proofErr w:type="spellEnd"/>
+      <w:r>
+        <w:t xml:space="preserve"> does NOT like spaces in the path name to files, so please </w:t>
+      </w:r>
+      <w:r>
+        <w:rPr>
+          <w:b/>
+          <w:bCs/>
+          <w:u w:val="single"/>
+        </w:rPr>
+        <w:t>DO NOT PUT SPACED IN THE PATH NAME TO YOUR REPOSITORY.</w:t>
+      </w:r>
+    </w:p>
+    <w:p>
+      <w:r>
         <w:t>Start by selecting Tools =&gt; Create and Package New IP….</w:t>
       </w:r>
     </w:p>
     <w:p>
       <w:r>
-        <w:lastRenderedPageBreak/>
         <w:t>You will be presented with the Create and Package New IP wizard:</w:t>
       </w:r>
     </w:p>
@@ -465,7 +587,27 @@
         <w:t>Peripheral Details:</w:t>
       </w:r>
       <w:r>
-        <w:t xml:space="preserve"> Complete name and IP location.  Click Next.</w:t>
+        <w:t xml:space="preserve"> </w:t>
+      </w:r>
+      <w:r>
+        <w:t xml:space="preserve">For Name please use </w:t>
+      </w:r>
+      <w:proofErr w:type="spellStart"/>
+      <w:r>
+        <w:t>enhancedPwm_AXI</w:t>
+      </w:r>
+      <w:proofErr w:type="spellEnd"/>
+      <w:r>
+        <w:t xml:space="preserve">.  Point to your </w:t>
+      </w:r>
+      <w:r>
+        <w:t>IP location</w:t>
+      </w:r>
+      <w:r>
+        <w:t xml:space="preserve"> created at the start</w:t>
+      </w:r>
+      <w:r>
+        <w:t>.  Click Next.</w:t>
       </w:r>
     </w:p>
     <w:p>
@@ -473,6 +615,7 @@
         <w:rPr>
           <w:noProof/>
         </w:rPr>
+        <w:lastRenderedPageBreak/>
         <w:drawing>
           <wp:inline distT="0" distB="0" distL="0" distR="0" wp14:anchorId="54B4A429" wp14:editId="7953A465">
             <wp:extent cx="2880000" cy="1955472"/>
@@ -520,7 +663,6 @@
           <w:b/>
           <w:bCs/>
         </w:rPr>
-        <w:lastRenderedPageBreak/>
         <w:t>Add Interfaces:</w:t>
       </w:r>
       <w:r>
@@ -626,6 +768,7 @@
     <w:p/>
     <w:p>
       <w:r>
+        <w:lastRenderedPageBreak/>
         <w:t xml:space="preserve">You have just created an empty shell of the new IP.  </w:t>
       </w:r>
       <w:r>
@@ -677,13 +820,25 @@
     </w:p>
     <w:p>
       <w:r>
-        <w:t xml:space="preserve">Before moving on, check to make sure that your IP wrapper will be created in VHDL.  Do this my right mouse clicking on the enhancedPWM_v1.0 IP element and selecting IP Settings…  </w:t>
-      </w:r>
-    </w:p>
-    <w:p/>
-    <w:p>
-      <w:r>
-        <w:lastRenderedPageBreak/>
+        <w:t xml:space="preserve">Before moving on, check to make sure that your IP wrapper will be created in VHDL.  Do this my right mouse clicking on the </w:t>
+      </w:r>
+      <w:proofErr w:type="spellStart"/>
+      <w:r>
+        <w:t>enhancedPWM_</w:t>
+      </w:r>
+      <w:r>
+        <w:t>AXI</w:t>
+      </w:r>
+      <w:proofErr w:type="spellEnd"/>
+      <w:r>
+        <w:t xml:space="preserve"> </w:t>
+      </w:r>
+      <w:r>
+        <w:t xml:space="preserve">IP element and selecting IP Settings…  </w:t>
+      </w:r>
+    </w:p>
+    <w:p>
+      <w:r>
         <w:t>In the Settings pop-up, select Project in the Tool Settings area.  Make sure that VHDL is selected as the Target Language.</w:t>
       </w:r>
     </w:p>
@@ -732,7 +887,18 @@
     <w:p/>
     <w:p>
       <w:r>
-        <w:t xml:space="preserve">It’s time to fill that shell with your custom logic. To do go to the IP Catalog tab, expand the User Repository -&gt; AXI Peripheral and then right click on “enhancedPwm_ip_v1.0” and select “Edit in </w:t>
+        <w:t>It’s time to fill that shell with your custom logic. To do go to the IP Catalog tab, expand the User Repository -&gt; AXI Peripheral and then right click on “</w:t>
+      </w:r>
+      <w:proofErr w:type="spellStart"/>
+      <w:r>
+        <w:t>enhancedPwm_</w:t>
+      </w:r>
+      <w:r>
+        <w:t>AXI</w:t>
+      </w:r>
+      <w:proofErr w:type="spellEnd"/>
+      <w:r>
+        <w:t xml:space="preserve">” and select “Edit in </w:t>
       </w:r>
       <w:r>
         <w:t xml:space="preserve">IP </w:t>
@@ -785,6 +951,7 @@
     </w:p>
     <w:p>
       <w:r>
+        <w:lastRenderedPageBreak/>
         <w:t xml:space="preserve">Leave the defaults.  Click OK.  If you are asked, click OK, to overwrite the previous version.  A new </w:t>
       </w:r>
       <w:r>
@@ -830,28 +997,15 @@
         <w:t xml:space="preserve"> component </w:t>
       </w:r>
       <w:r>
-        <w:t xml:space="preserve">into a form that will make it compatible </w:t>
-      </w:r>
-      <w:proofErr w:type="gramStart"/>
-      <w:r>
-        <w:t>to</w:t>
-      </w:r>
-      <w:proofErr w:type="gramEnd"/>
-      <w:r>
-        <w:t xml:space="preserve"> the AXI bus used by the Zynq processor.  </w:t>
-      </w:r>
-    </w:p>
-    <w:p>
-      <w:r>
-        <w:t xml:space="preserve">Before you start make sure that you have a pair of files in the Design Sources that </w:t>
-      </w:r>
-      <w:proofErr w:type="gramStart"/>
-      <w:r>
-        <w:t>looks</w:t>
-      </w:r>
-      <w:proofErr w:type="gramEnd"/>
-      <w:r>
-        <w:t xml:space="preserve"> like the following.  If you don’t follow the instructions below before proceeding.</w:t>
+        <w:t xml:space="preserve">into a form that will make it compatible to the AXI bus used by the Zynq processor.  </w:t>
+      </w:r>
+    </w:p>
+    <w:p>
+      <w:r>
+        <w:t>Before you start make sure that you have a pair of files in the Design Sources that looks like the following.  If you don’t follow the instructions below before proceeding.</w:t>
+      </w:r>
+      <w:r>
+        <w:t xml:space="preserve">  Note, I named my top-level slightly differently than you have been instructed.</w:t>
       </w:r>
     </w:p>
     <w:p>
@@ -898,7 +1052,6 @@
     </w:p>
     <w:p>
       <w:r>
-        <w:lastRenderedPageBreak/>
         <w:t xml:space="preserve">If you have just a single file (just </w:t>
       </w:r>
       <w:r>
@@ -918,6 +1071,9 @@
       <w:proofErr w:type="spellStart"/>
       <w:r>
         <w:t>enhancedPwm</w:t>
+      </w:r>
+      <w:r>
+        <w:t>_AXI</w:t>
       </w:r>
       <w:proofErr w:type="spellEnd"/>
       <w:r>
@@ -991,6 +1147,7 @@
         <w:rPr>
           <w:noProof/>
         </w:rPr>
+        <w:lastRenderedPageBreak/>
         <w:drawing>
           <wp:inline distT="0" distB="0" distL="0" distR="0" wp14:anchorId="1C16F99F" wp14:editId="387316EA">
             <wp:extent cx="1800000" cy="1410098"/>
@@ -1085,7 +1242,6 @@
         <w:rPr>
           <w:noProof/>
         </w:rPr>
-        <w:lastRenderedPageBreak/>
         <w:drawing>
           <wp:inline distT="0" distB="0" distL="0" distR="0" wp14:anchorId="7F4015D3" wp14:editId="32316447">
             <wp:extent cx="3683156" cy="2500132"/>
@@ -1208,6 +1364,7 @@
           <w:sz w:val="36"/>
           <w:szCs w:val="36"/>
         </w:rPr>
+        <w:lastRenderedPageBreak/>
         <w:t>Edits to:</w:t>
       </w:r>
       <w:r>
@@ -1249,7 +1406,6 @@
       <w:r>
         <w:t xml:space="preserve"> </w:t>
       </w:r>
-      <w:proofErr w:type="gramStart"/>
       <w:r>
         <w:t>enhancePwm_2024_slave_lite_v1_0_S00_AXI</w:t>
       </w:r>
@@ -1260,56 +1416,44 @@
         <w:t xml:space="preserve">vhd  </w:t>
       </w:r>
       <w:r>
-        <w:t>Open</w:t>
-      </w:r>
-      <w:proofErr w:type="gramEnd"/>
+        <w:t xml:space="preserve">Open </w:t>
+      </w:r>
+      <w:r>
+        <w:t xml:space="preserve">the </w:t>
+      </w:r>
+      <w:proofErr w:type="spellStart"/>
+      <w:r>
+        <w:t>enhancedPwm.vhd</w:t>
+      </w:r>
+      <w:proofErr w:type="spellEnd"/>
+      <w:r>
+        <w:t xml:space="preserve"> file, cop</w:t>
+      </w:r>
+      <w:r>
+        <w:t>y</w:t>
+      </w:r>
+      <w:r>
+        <w:t xml:space="preserve"> the entity description </w:t>
+      </w:r>
+      <w:r>
+        <w:t xml:space="preserve">for the </w:t>
+      </w:r>
+      <w:proofErr w:type="spellStart"/>
+      <w:r>
+        <w:t>enhancedPwm</w:t>
+      </w:r>
+      <w:proofErr w:type="spellEnd"/>
       <w:r>
         <w:t xml:space="preserve"> </w:t>
       </w:r>
       <w:r>
-        <w:t xml:space="preserve">the </w:t>
-      </w:r>
-      <w:proofErr w:type="spellStart"/>
-      <w:r>
-        <w:t>enhancedPwm.vhd</w:t>
-      </w:r>
-      <w:proofErr w:type="spellEnd"/>
-      <w:r>
-        <w:t xml:space="preserve"> file, cop</w:t>
-      </w:r>
-      <w:r>
-        <w:t>y</w:t>
-      </w:r>
-      <w:r>
-        <w:t xml:space="preserve"> the entity description </w:t>
-      </w:r>
-      <w:r>
-        <w:t xml:space="preserve">for the </w:t>
-      </w:r>
-      <w:proofErr w:type="spellStart"/>
-      <w:r>
-        <w:t>enhancedPwm</w:t>
-      </w:r>
-      <w:proofErr w:type="spellEnd"/>
-      <w:r>
-        <w:t xml:space="preserve"> </w:t>
-      </w:r>
-      <w:r>
-        <w:t xml:space="preserve">and then paste it into </w:t>
-      </w:r>
-      <w:proofErr w:type="gramStart"/>
-      <w:r>
-        <w:t xml:space="preserve">the  </w:t>
+        <w:t xml:space="preserve">and then paste it into the  </w:t>
       </w:r>
       <w:r>
         <w:t>enhancePwm_2024_slave_lite_v1_0_S00_AXI</w:t>
       </w:r>
       <w:r>
-        <w:t>.vhd</w:t>
-      </w:r>
-      <w:proofErr w:type="gramEnd"/>
-      <w:r>
-        <w:t xml:space="preserve"> file </w:t>
+        <w:t xml:space="preserve">.vhd file </w:t>
       </w:r>
       <w:r>
         <w:t xml:space="preserve">below the signal declarations and just before the begin statement </w:t>
@@ -1389,15 +1533,7 @@
     </w:p>
     <w:p>
       <w:r>
-        <w:t xml:space="preserve">*Please note, your line numbers will be different as this screen shot </w:t>
-      </w:r>
-      <w:proofErr w:type="gramStart"/>
-      <w:r>
-        <w:t>represent</w:t>
-      </w:r>
-      <w:proofErr w:type="gramEnd"/>
-      <w:r>
-        <w:t xml:space="preserve"> the file when it was completed.  You have only just started editing the file.</w:t>
+        <w:t>*Please note, your line numbers will be different as this screen shot represent the file when it was completed.  You have only just started editing the file.</w:t>
       </w:r>
     </w:p>
     <w:p>
@@ -1559,15 +1695,8 @@
     </w:p>
     <w:p>
       <w:r>
-        <w:t xml:space="preserve">*Please note, your line numbers will be different as this screen shot </w:t>
-      </w:r>
-      <w:proofErr w:type="gramStart"/>
-      <w:r>
-        <w:t>represent</w:t>
-      </w:r>
-      <w:proofErr w:type="gramEnd"/>
-      <w:r>
-        <w:t xml:space="preserve"> the file when it was completed.  You have only just started editing the file.</w:t>
+        <w:lastRenderedPageBreak/>
+        <w:t>*Please note, your line numbers will be different as this screen shot represent the file when it was completed.  You have only just started editing the file.</w:t>
       </w:r>
     </w:p>
     <w:p>
@@ -1730,7 +1859,6 @@
     <w:p/>
     <w:p>
       <w:r>
-        <w:lastRenderedPageBreak/>
         <w:t xml:space="preserve">You are done editing </w:t>
       </w:r>
       <w:r>
@@ -1796,15 +1924,7 @@
       </w:r>
       <w:proofErr w:type="spellEnd"/>
       <w:r>
-        <w:t xml:space="preserve"> signals outside this module.  It’s </w:t>
-      </w:r>
-      <w:proofErr w:type="gramStart"/>
-      <w:r>
-        <w:t>fairly straightforward</w:t>
-      </w:r>
-      <w:proofErr w:type="gramEnd"/>
-      <w:r>
-        <w:t>.</w:t>
+        <w:t xml:space="preserve"> signals outside this module.  It’s fairly straightforward.</w:t>
       </w:r>
     </w:p>
     <w:p>
@@ -1886,6 +2006,7 @@
         <w:rPr>
           <w:noProof/>
         </w:rPr>
+        <w:lastRenderedPageBreak/>
         <w:drawing>
           <wp:inline distT="0" distB="0" distL="0" distR="0" wp14:anchorId="6744F643" wp14:editId="50563BCC">
             <wp:extent cx="3311352" cy="1371600"/>
@@ -1986,7 +2107,6 @@
     <w:p/>
     <w:p>
       <w:r>
-        <w:lastRenderedPageBreak/>
         <w:t xml:space="preserve">Save </w:t>
       </w:r>
       <w:r>
@@ -2054,18 +2174,7 @@
         <w:t>I’d suggest an extra layer of syntax checking by running a behavioral simulation.  You should only do this to check for warnings and errors in the Messages area at the bottom of the screen.  Only pay attention to syntax-related errors.  Ignore things like “Spawn Error”</w:t>
       </w:r>
       <w:r>
-        <w:t>.   You can also</w:t>
-      </w:r>
-      <w:r>
-        <w:t xml:space="preserve"> try to Generate Bitstream to weed out all elaboration errors from vector size </w:t>
-      </w:r>
-      <w:proofErr w:type="gramStart"/>
-      <w:r>
-        <w:t>mis-matches</w:t>
-      </w:r>
-      <w:proofErr w:type="gramEnd"/>
-      <w:r>
-        <w:t xml:space="preserve">.  </w:t>
+        <w:t xml:space="preserve">.   You can also try to Generate Bitstream to weed out all elaboration errors from vector size mis-matches.  </w:t>
       </w:r>
     </w:p>
     <w:p>
@@ -2108,6 +2217,7 @@
           <w:b/>
           <w:bCs/>
         </w:rPr>
+        <w:lastRenderedPageBreak/>
         <w:t>Compatibility</w:t>
       </w:r>
       <w:r>
@@ -2123,26 +2233,16 @@
         <w:t>File Groups</w:t>
       </w:r>
       <w:r>
-        <w:t xml:space="preserve"> – Click on “Merge changes from File Groups </w:t>
-      </w:r>
-      <w:proofErr w:type="gramStart"/>
-      <w:r>
-        <w:t>Wizard”</w:t>
-      </w:r>
-      <w:r>
-        <w:t xml:space="preserve">  This</w:t>
-      </w:r>
-      <w:proofErr w:type="gramEnd"/>
-      <w:r>
-        <w:t xml:space="preserve"> step saves the state of the project.  You MUST do this before quitting otherwise you will </w:t>
+        <w:t xml:space="preserve"> – Click on “Merge changes from File Groups Wizard”</w:t>
+      </w:r>
+      <w:r>
+        <w:t xml:space="preserve">  This step saves the state of the project.  You MUST do this before quitting otherwise you will </w:t>
       </w:r>
       <w:proofErr w:type="spellStart"/>
-      <w:proofErr w:type="gramStart"/>
       <w:r>
         <w:t>loose</w:t>
       </w:r>
       <w:proofErr w:type="spellEnd"/>
-      <w:proofErr w:type="gramEnd"/>
       <w:r>
         <w:t xml:space="preserve"> all your work.  Ask me how I know :/</w:t>
       </w:r>
@@ -2263,7 +2363,6 @@
           <w:b/>
           <w:bCs/>
         </w:rPr>
-        <w:lastRenderedPageBreak/>
         <w:t>Ports and Interfaces</w:t>
       </w:r>
       <w:r>
@@ -2360,6 +2459,7 @@
         <w:rPr>
           <w:noProof/>
         </w:rPr>
+        <w:lastRenderedPageBreak/>
         <w:drawing>
           <wp:inline distT="0" distB="0" distL="0" distR="0" wp14:anchorId="7EB10F4D" wp14:editId="69A5032B">
             <wp:extent cx="2880000" cy="1386462"/>
@@ -2498,7 +2598,6 @@
         <w:ind w:left="0" w:firstLine="0"/>
       </w:pPr>
       <w:r>
-        <w:lastRenderedPageBreak/>
         <w:t>When you get all the errors corrected, you should be safe to complete the process to generate your IP.</w:t>
       </w:r>
     </w:p>
@@ -2559,6 +2658,7 @@
     <w:p/>
     <w:p>
       <w:r>
+        <w:lastRenderedPageBreak/>
         <w:t>Click the Re-Package IP button and agree to close the project.  You can close this project when it’s done.</w:t>
       </w:r>
     </w:p>

</xml_diff>